<commit_message>
docs: add formal research paper objectives, hypotheses, and scope to master document
</commit_message>
<xml_diff>
--- a/COG_EW_Master_Project_Document.docx
+++ b/COG_EW_Master_Project_Document.docx
@@ -728,18 +728,210 @@
     <w:p/>
     <w:p>
       <w:pPr>
-        <w:pStyle w:val="Heading3"/>
+        <w:pStyle w:val="Heading2"/>
         <w:keepNext/>
-        <w:spacing w:before="200" w:after="60"/>
+        <w:spacing w:before="280" w:after="80"/>
       </w:pPr>
       <w:r>
         <w:rPr>
           <w:rFonts w:ascii="Calibri" w:hAnsi="Calibri"/>
           <w:b/>
+          <w:color w:val="2B6CB0"/>
+          <w:sz w:val="26"/>
+        </w:rPr>
+        <w:t>I. Research Objectives, Scientific Scope &amp; Hypotheses</w:t>
+      </w:r>
+    </w:p>
+    <w:p>
+      <w:pPr>
+        <w:spacing w:after="80" w:line="276" w:lineRule="auto"/>
+      </w:pPr>
+      <w:r>
+        <w:rPr>
+          <w:rFonts w:ascii="Calibri" w:hAnsi="Calibri"/>
+          <w:b/>
+          <w:color w:val="1A202C"/>
+          <w:sz w:val="21"/>
+        </w:rPr>
+        <w:t xml:space="preserve">Problem Motivation &amp; Scope: </w:t>
+      </w:r>
+      <w:r>
+        <w:rPr>
+          <w:rFonts w:ascii="Calibri" w:hAnsi="Calibri"/>
           <w:color w:val="2D3748"/>
-          <w:sz w:val="23"/>
+          <w:sz w:val="20"/>
         </w:rPr>
-        <w:t>Mathematical Problem Formulations</w:t>
+        <w:t>The overarching goal of the COG-EW research initiative is to formulate, implement, and empirically validate an edge-deployable cyber-physical architecture that unifies real-time radio frequency (RF) perception with predictive flight kinematics under strict hypersonic aerothermodynamic and structural load constraints. To fulfill this overarching goal, the research is governed by four primary published objectives:</w:t>
+      </w:r>
+    </w:p>
+    <w:p>
+      <w:pPr>
+        <w:pStyle w:val="ListBullet"/>
+        <w:spacing w:after="60" w:line="276" w:lineRule="auto"/>
+      </w:pPr>
+      <w:r>
+        <w:rPr>
+          <w:rFonts w:ascii="Calibri" w:hAnsi="Calibri"/>
+          <w:b/>
+          <w:color w:val="1A202C"/>
+          <w:sz w:val="20"/>
+        </w:rPr>
+        <w:t xml:space="preserve">Objective 1 (Real-Time Sub-Millisecond RF Perception): </w:t>
+      </w:r>
+      <w:r>
+        <w:rPr>
+          <w:rFonts w:ascii="Calibri" w:hAnsi="Calibri"/>
+          <w:color w:val="2D3748"/>
+          <w:sz w:val="20"/>
+        </w:rPr>
+        <w:t>Engineer and benchmark an edge-deployable Deep Residual Convolutional Neural Network (adapted ResNet-18) capable of ingesting raw In-Phase/Quadrature (I/Q) complex tensors (shape: 2 x 1024 float32) directly from ESM digitized frontends to classify 24 distinct analog and digital modulation schemes within sub-0.03 millisecond inference latency on dedicated edge GPU hardware.</w:t>
+      </w:r>
+    </w:p>
+    <w:p>
+      <w:pPr>
+        <w:pStyle w:val="ListBullet"/>
+        <w:spacing w:after="60" w:line="276" w:lineRule="auto"/>
+      </w:pPr>
+      <w:r>
+        <w:rPr>
+          <w:rFonts w:ascii="Calibri" w:hAnsi="Calibri"/>
+          <w:b/>
+          <w:color w:val="1A202C"/>
+          <w:sz w:val="20"/>
+        </w:rPr>
+        <w:t xml:space="preserve">Objective 2 (Autonomous Multi-Mode Electronic Warfare Allocation): </w:t>
+      </w:r>
+      <w:r>
+        <w:rPr>
+          <w:rFonts w:ascii="Calibri" w:hAnsi="Calibri"/>
+          <w:color w:val="2D3748"/>
+          <w:sz w:val="20"/>
+        </w:rPr>
+        <w:t>Formulate a closed-loop Cognitive Decision &amp; Electronic Countermeasure Arbitrator (OODA cycle) that evaluates intercepted radar modes (Search vs Acquisition vs Fire-Control SAM Tracking) and dynamically allocates electronic countermeasures (45 kW Barrage Noise Saturation vs Deceptive Range Gate Pull-Off [RGPO] Spoofing vs Passive ESM Monitoring) based on real-time signal-to-noise ratio (SNR) and threat severity.</w:t>
+      </w:r>
+    </w:p>
+    <w:p>
+      <w:pPr>
+        <w:pStyle w:val="ListBullet"/>
+        <w:spacing w:after="60" w:line="276" w:lineRule="auto"/>
+      </w:pPr>
+      <w:r>
+        <w:rPr>
+          <w:rFonts w:ascii="Calibri" w:hAnsi="Calibri"/>
+          <w:b/>
+          <w:color w:val="1A202C"/>
+          <w:sz w:val="20"/>
+        </w:rPr>
+        <w:t xml:space="preserve">Objective 3 (Deep Learning Grounded Flight Guidance &amp; Trajectory Co-Design): </w:t>
+      </w:r>
+      <w:r>
+        <w:rPr>
+          <w:rFonts w:ascii="Calibri" w:hAnsi="Calibri"/>
+          <w:color w:val="2D3748"/>
+          <w:sz w:val="20"/>
+        </w:rPr>
+        <w:t>Develop and cross-validate a Temporal Convolutional Residual Guidance Network (TCNResNet) trained on authentic multi-axis Pixhawk UAV flight telemetry (120 flights partitioned into leak-free 60/15/15/10% cross-validation splits) to generate stable multi-step lookahead flight trajectories (10-step horizon: +0.1s to +1.0s) while strictly observing structural load limits (G &lt;= 6.5g continuous, 10g peak) and thermal bounds (T &lt;= 1800 K).</w:t>
+      </w:r>
+    </w:p>
+    <w:p>
+      <w:pPr>
+        <w:pStyle w:val="ListBullet"/>
+        <w:spacing w:after="60" w:line="276" w:lineRule="auto"/>
+      </w:pPr>
+      <w:r>
+        <w:rPr>
+          <w:rFonts w:ascii="Calibri" w:hAnsi="Calibri"/>
+          <w:b/>
+          <w:color w:val="1A202C"/>
+          <w:sz w:val="20"/>
+        </w:rPr>
+        <w:t xml:space="preserve">Objective 4 (Autonomous Standoff Strike &amp; 100% Reusable Egress Doctrine): </w:t>
+      </w:r>
+      <w:r>
+        <w:rPr>
+          <w:rFonts w:ascii="Calibri" w:hAnsi="Calibri"/>
+          <w:color w:val="2D3748"/>
+          <w:sz w:val="20"/>
+        </w:rPr>
+        <w:t>Establish an operational doctrine and hardware-in-the-loop simulation verifying that hypersonic waverider platforms maintain stratospheric cruise (Mach 5.2, h = 29,500 m), execute ventral release of a hypersonic kinetic glide penetrator against deep strategic bunkers, and perform a high-altitude supersonic climb (+10° AoA, ascending to 31,500m - 32,500m) and egress bank to achieve a &gt;98% survivability index as a 100% reusable strategic military asset.</w:t>
+      </w:r>
+    </w:p>
+    <w:tbl>
+      <w:tblPr>
+        <w:tblW w:type="auto" w:w="0"/>
+        <w:jc w:val="center"/>
+        <w:tblLook w:firstColumn="1" w:firstRow="1" w:lastColumn="0" w:lastRow="0" w:noHBand="0" w:noVBand="1" w:val="04A0"/>
+      </w:tblPr>
+      <w:tblGrid>
+        <w:gridCol w:w="9936"/>
+      </w:tblGrid>
+      <w:tr>
+        <w:tc>
+          <w:tcPr>
+            <w:tcW w:type="dxa" w:w="9936"/>
+            <w:shd w:fill="F7FAFC"/>
+            <w:tcMar>
+              <w:top w:w="140" w:type="dxa"/>
+              <w:bottom w:w="140" w:type="dxa"/>
+              <w:left w:w="200" w:type="dxa"/>
+              <w:right w:w="200" w:type="dxa"/>
+            </w:tcMar>
+            <w:tcBorders>
+              <w:left w:val="single" w:sz="24" w:space="0" w:color="1A365D"/>
+              <w:top w:val="none"/>
+              <w:bottom w:val="none"/>
+              <w:right w:val="none"/>
+            </w:tcBorders>
+          </w:tcPr>
+          <w:p>
+            <w:pPr>
+              <w:spacing w:before="40" w:after="40"/>
+            </w:pPr>
+            <w:r>
+              <w:rPr>
+                <w:rFonts w:ascii="Arial" w:hAnsi="Arial"/>
+                <w:b/>
+                <w:color w:val="1A365D"/>
+                <w:sz w:val="21"/>
+              </w:rPr>
+              <w:t>📌 CORE SCIENTIFIC HYPOTHESES &amp; CONTRIBUTION BOUNDS</w:t>
+              <w:br/>
+            </w:r>
+            <w:r>
+              <w:rPr>
+                <w:rFonts w:ascii="Arial" w:hAnsi="Arial"/>
+                <w:color w:val="2D3748"/>
+                <w:sz w:val="19"/>
+              </w:rPr>
+              <w:t>RESEARCH HYPOTHESIS H1 (Perception): Downconverting RF signals to raw 2x1024 baseband tensors preserves complete instantaneous phase and frequency coherence, allowing deep residual feature extraction to exceed 90% classification accuracy in the actionable operational regime (SNR &gt;= +6 dB) without manual feature engineering.</w:t>
+              <w:br/>
+              <w:br/>
+              <w:t>RESEARCH HYPOTHESIS H2 (Co-Design): Coupling electronic attack deception with simultaneous aerodynamic bank-to-turn maneuvers breaks multi-static radar tracking lock with &gt;94% probability while consuming 42% less propellant mass than pure physical high-G evasion maneuvers alone.</w:t>
+            </w:r>
+          </w:p>
+        </w:tc>
+      </w:tr>
+    </w:tbl>
+    <w:p>
+      <w:pPr>
+        <w:spacing w:after="80"/>
+      </w:pPr>
+    </w:p>
+    <w:p/>
+    <w:p>
+      <w:pPr>
+        <w:pStyle w:val="Heading2"/>
+        <w:keepNext/>
+        <w:spacing w:before="280" w:after="80"/>
+      </w:pPr>
+      <w:r>
+        <w:rPr>
+          <w:rFonts w:ascii="Calibri" w:hAnsi="Calibri"/>
+          <w:b/>
+          <w:color w:val="2B6CB0"/>
+          <w:sz w:val="26"/>
+        </w:rPr>
+        <w:t>II. Mathematical Formulation &amp; Flight Dynamics</w:t>
       </w:r>
     </w:p>
     <w:p>

</xml_diff>